<commit_message>
Prepare marketplace v36 documentation
</commit_message>
<xml_diff>
--- a/Deal Invoice Summary - полное описание продукта final.docx
+++ b/Deal Invoice Summary - полное описание продукта final.docx
@@ -1,5 +1,38 @@
 
-<file path=word/document.xml><?xml version="1.0" encoding="utf-8"?>
+<file path=docProps\app.xml><?xml version="1.0" encoding="utf-8"?>
+<Properties xmlns="http://schemas.openxmlformats.org/officeDocument/2006/extended-properties" xmlns:vt="http://schemas.openxmlformats.org/officeDocument/2006/docPropsVTypes">
+  <Template>Normal.dotm</Template>
+  <TotalTime>3</TotalTime>
+  <Pages>1</Pages>
+  <Words>3277</Words>
+  <Characters>18681</Characters>
+  <Application>Microsoft Office Word</Application>
+  <DocSecurity>0</DocSecurity>
+  <Lines>155</Lines>
+  <Paragraphs>43</Paragraphs>
+  <ScaleCrop>false</ScaleCrop>
+  <Company/>
+  <LinksUpToDate>false</LinksUpToDate>
+  <CharactersWithSpaces>21915</CharactersWithSpaces>
+  <SharedDoc>false</SharedDoc>
+  <HyperlinksChanged>false</HyperlinksChanged>
+  <AppVersion>16.0000</AppVersion>
+</Properties>
+</file>
+
+<file path=docProps\core.xml><?xml version="1.0" encoding="utf-8"?>
+<cp:coreProperties xmlns:cp="http://schemas.openxmlformats.org/package/2006/metadata/core-properties" xmlns:dc="http://purl.org/dc/elements/1.1/" xmlns:dcterms="http://purl.org/dc/terms/" xmlns:dcmitype="http://purl.org/dc/dcmitype/" xmlns:xsi="http://www.w3.org/2001/XMLSchema-instance">
+  <dc:title>Полное описание продукта Deal Invoice Summary</dc:title>
+  <dc:subject>Расчёт оплаты счетов для Bitrix24</dc:subject>
+  <dc:creator>AI Project B24</dc:creator>
+  <cp:lastModifiedBy>Иван Ковальчук</cp:lastModifiedBy>
+  <cp:revision>3</cp:revision>
+  <dcterms:created xsi:type="dcterms:W3CDTF">2026-08-25T13:51:00Z</dcterms:created>
+  <dcterms:modified xsi:type="dcterms:W3CDTF">2026-08-25T15:05:00Z</dcterms:modified>
+</cp:coreProperties>
+</file>
+
+<file path=word\document.xml><?xml version="1.0" encoding="utf-8"?>
 <w:document xmlns:wpc="http://schemas.microsoft.com/office/word/2010/wordprocessingCanvas" xmlns:cx="http://schemas.microsoft.com/office/drawing/2014/chartex" xmlns:cx1="http://schemas.microsoft.com/office/drawing/2015/9/8/chartex" xmlns:cx2="http://schemas.microsoft.com/office/drawing/2015/10/21/chartex" xmlns:cx3="http://schemas.microsoft.com/office/drawing/2016/5/9/chartex" xmlns:cx4="http://schemas.microsoft.com/office/drawing/2016/5/10/chartex" xmlns:cx5="http://schemas.microsoft.com/office/drawing/2016/5/11/chartex" xmlns:cx6="http://schemas.microsoft.com/office/drawing/2016/5/12/chartex" xmlns:cx7="http://schemas.microsoft.com/office/drawing/2016/5/13/chartex" xmlns:cx8="http://schemas.microsoft.com/office/drawing/2016/5/14/chartex" xmlns:mc="http://schemas.openxmlformats.org/markup-compatibility/2006" xmlns:aink="http://schemas.microsoft.com/office/drawing/2016/ink" xmlns:am3d="http://schemas.microsoft.com/office/drawing/2017/model3d" xmlns:o="urn:schemas-microsoft-com:office:office" xmlns:r="http://schemas.openxmlformats.org/officeDocument/2006/relationships" xmlns:m="http://schemas.openxmlformats.org/officeDocument/2006/math" xmlns:v="urn:schemas-microsoft-com:vml" xmlns:wp14="http://schemas.microsoft.com/office/word/2010/wordprocessingDrawing" xmlns:wp="http://schemas.openxmlformats.org/drawingml/2006/wordprocessingDrawing" xmlns:w10="urn:schemas-microsoft-com:office:word" xmlns:w="http://schemas.openxmlformats.org/wordprocessingml/2006/main" xmlns:w14="http://schemas.microsoft.com/office/word/2010/wordml" xmlns:w15="http://schemas.microsoft.com/office/word/2012/wordml" xmlns:w16cex="http://schemas.microsoft.com/office/word/2018/wordml/cex" xmlns:w16cid="http://schemas.microsoft.com/office/word/2016/wordml/cid" xmlns:w16="http://schemas.microsoft.com/office/word/2018/wordml" xmlns:w16sdtdh="http://schemas.microsoft.com/office/word/2020/wordml/sdtdatahash" xmlns:w16se="http://schemas.microsoft.com/office/word/2015/wordml/symex" xmlns:wpg="http://schemas.microsoft.com/office/word/2010/wordprocessingGroup" xmlns:wpi="http://schemas.microsoft.com/office/word/2010/wordprocessingInk" xmlns:wne="http://schemas.microsoft.com/office/word/2006/wordml" xmlns:wps="http://schemas.microsoft.com/office/word/2010/wordprocessingShape" mc:Ignorable="w14 w15 w16se w16cid w16 w16cex w16sdtdh wp14">
   <w:body>
     <w:p>
@@ -79,7 +112,7 @@
           <w:rFonts w:ascii="Calibri" w:hAnsi="Calibri" w:cs="Calibri"/>
           <w:color w:val="666666"/>
         </w:rPr>
-        <w:t>Расчёт оплаты счетов для Bitrix24. Версия описания: 25.08.2026. Актуальная</w:t>
+        <w:t>Расчёт оплаты счетов для Bitrix24. Версия описания: 26.08.2026. Актуальная</w:t>
       </w:r>
       <w:r>
         <w:rPr>
@@ -117,7 +150,7 @@
           <w:color w:val="666666"/>
           <w:lang w:val="en-US"/>
         </w:rPr>
-        <w:t>: Deal Invoice Summary v.34 Marketplace B24.</w:t>
+        <w:t>: Deal Invoice Summary v.36 Marketplace B24.</w:t>
       </w:r>
     </w:p>
     <w:p>
@@ -3762,6 +3795,11 @@
       </w:r>
     </w:p>
     <w:p>
+      <w:r>
+        <w:t xml:space="preserve">• Пользовательский скоуп Bitrix24 указывать как Пользователи (базовый) / user_basic. Он нужен только для метода user.get, чтобы показывать ФИО ответственных по счетам в таблице и CSV-отчете. Полный скоуп Пользователи / user не требуется: приложение не вызывает user.add, user.update и не изменяет профили пользователей.</w:t>
+      </w:r>
+    </w:p>
+    <w:p>
       <w:pPr>
         <w:spacing w:after="80"/>
         <w:ind w:left="360" w:hanging="360"/>
@@ -4030,7 +4068,7 @@
           <w:color w:val="000000"/>
           <w:lang w:val="en-US"/>
         </w:rPr>
-        <w:t>: Deal Invoice Summary v.34 Marketplace B24.</w:t>
+        <w:t>: Deal Invoice Summary v.36 Marketplace B24.</w:t>
       </w:r>
     </w:p>
     <w:p>
@@ -5168,6 +5206,39 @@
           <w:color w:val="000000"/>
         </w:rPr>
         <w:t>ать отдельный backend.</w:t>
+      </w:r>
+    </w:p>
+    <w:p>
+      <w:r>
+        <w:rPr>
+          <w:b/>
+        </w:rPr>
+        <w:t xml:space="preserve">Актуализация v36 от 26.08.2026</w:t>
+      </w:r>
+    </w:p>
+    <w:p>
+      <w:r>
+        <w:t xml:space="preserve">Актуальная сборка продукта: Deal Invoice Summary v.36 Marketplace B24. Технический marker/cache-busting: layout-20260826-2.</w:t>
+      </w:r>
+    </w:p>
+    <w:p>
+      <w:r>
+        <w:t xml:space="preserve">В v36 сохранён принцип мягкого обновления из v35: PAGE_BACKGROUND_WORKER не вызывает полный BX24.reloadWindow() после автоматической записи расчётных полей. После crm.deal.update worker пробует только BX24.placement.call("reloadData") там, где команда доступна, а при недоступности сохраняет диагностику без принудительной перезагрузки окна Bitrix24.</w:t>
+      </w:r>
+    </w:p>
+    <w:p>
+      <w:r>
+        <w:t xml:space="preserve">Новая логика v36 для канбан-доски: worker запоминает последнюю открытую карточку сделки в dealInvoiceSummaryLastSeenDeal, заново читает активный контекст через BX24.placement.info() и PLACEMENT_OPTIONS.URI на каждом цикле, распознаёт kanban URL и раз в 15 секунд приоритетно проверяет последнюю сделку через crm.deal.get.</w:t>
+      </w:r>
+    </w:p>
+    <w:p>
+      <w:r>
+        <w:t xml:space="preserve">Если пользователь открыл сделку с канбан-доски, сохранил изменения и закрыл карточку обратно на канбан, worker проверяет именно эту сделку и при изменении сохранённых данных запускает обычный serverless-пересчёт операцией background-kanban-return-recalculate. Если последняя сделка неизвестна, остаётся общий fallback через crm.deal.list по DATE_MODIFY DESC.</w:t>
+      </w:r>
+    </w:p>
+    <w:p>
+      <w:r>
+        <w:t xml:space="preserve">Текущие REST-методы, необходимые для работы Marketplace-версии: placement.bind, app.option.get, app.option.set, crm.deal.get, crm.deal.list, crm.deal.update, crm.deal.fields, crm.deal.userfield.list, crm.deal.userfield.add, crm.item.list, crm.status.list, crm.status.entity.types, crm.category.list и user.get (со скоупом Пользователи (базовый) / user_basic).</w:t>
       </w:r>
     </w:p>
     <w:sectPr>
@@ -5179,7 +5250,77 @@
 </w:document>
 </file>
 
-<file path=word/styles.xml><?xml version="1.0" encoding="utf-8"?>
+<file path=word\fontTable.xml><?xml version="1.0" encoding="utf-8"?>
+<w:fonts xmlns:mc="http://schemas.openxmlformats.org/markup-compatibility/2006" xmlns:r="http://schemas.openxmlformats.org/officeDocument/2006/relationships" xmlns:w="http://schemas.openxmlformats.org/wordprocessingml/2006/main" xmlns:w14="http://schemas.microsoft.com/office/word/2010/wordml" xmlns:w15="http://schemas.microsoft.com/office/word/2012/wordml" xmlns:w16cex="http://schemas.microsoft.com/office/word/2018/wordml/cex" xmlns:w16cid="http://schemas.microsoft.com/office/word/2016/wordml/cid" xmlns:w16="http://schemas.microsoft.com/office/word/2018/wordml" xmlns:w16sdtdh="http://schemas.microsoft.com/office/word/2020/wordml/sdtdatahash" xmlns:w16se="http://schemas.microsoft.com/office/word/2015/wordml/symex" mc:Ignorable="w14 w15 w16se w16cid w16 w16cex w16sdtdh">
+  <w:font w:name="Calibri">
+    <w:panose1 w:val="020F0502020204030204"/>
+    <w:charset w:val="CC"/>
+    <w:family w:val="swiss"/>
+    <w:pitch w:val="variable"/>
+    <w:sig w:usb0="E4002EFF" w:usb1="C200247B" w:usb2="00000009" w:usb3="00000000" w:csb0="000001FF" w:csb1="00000000"/>
+  </w:font>
+  <w:font w:name="Times New Roman">
+    <w:panose1 w:val="02020603050405020304"/>
+    <w:charset w:val="CC"/>
+    <w:family w:val="roman"/>
+    <w:pitch w:val="variable"/>
+    <w:sig w:usb0="E0002EFF" w:usb1="C000785B" w:usb2="00000009" w:usb3="00000000" w:csb0="000001FF" w:csb1="00000000"/>
+  </w:font>
+  <w:font w:name="Calibri Light">
+    <w:panose1 w:val="020F0302020204030204"/>
+    <w:charset w:val="CC"/>
+    <w:family w:val="swiss"/>
+    <w:pitch w:val="variable"/>
+    <w:sig w:usb0="E4002EFF" w:usb1="C200247B" w:usb2="00000009" w:usb3="00000000" w:csb0="000001FF" w:csb1="00000000"/>
+  </w:font>
+</w:fonts>
+</file>
+
+<file path=word\settings.xml><?xml version="1.0" encoding="utf-8"?>
+<w:settings xmlns:mc="http://schemas.openxmlformats.org/markup-compatibility/2006" xmlns:o="urn:schemas-microsoft-com:office:office" xmlns:r="http://schemas.openxmlformats.org/officeDocument/2006/relationships" xmlns:m="http://schemas.openxmlformats.org/officeDocument/2006/math" xmlns:v="urn:schemas-microsoft-com:vml" xmlns:w10="urn:schemas-microsoft-com:office:word" xmlns:w="http://schemas.openxmlformats.org/wordprocessingml/2006/main" xmlns:w14="http://schemas.microsoft.com/office/word/2010/wordml" xmlns:w15="http://schemas.microsoft.com/office/word/2012/wordml" xmlns:w16cex="http://schemas.microsoft.com/office/word/2018/wordml/cex" xmlns:w16cid="http://schemas.microsoft.com/office/word/2016/wordml/cid" xmlns:w16="http://schemas.microsoft.com/office/word/2018/wordml" xmlns:w16sdtdh="http://schemas.microsoft.com/office/word/2020/wordml/sdtdatahash" xmlns:w16se="http://schemas.microsoft.com/office/word/2015/wordml/symex" xmlns:sl="http://schemas.openxmlformats.org/schemaLibrary/2006/main" mc:Ignorable="w14 w15 w16se w16cid w16 w16cex w16sdtdh">
+  <w:zoom w:percent="100"/>
+  <w:proofState w:spelling="clean" w:grammar="clean"/>
+  <w:defaultTabStop w:val="708"/>
+  <w:characterSpacingControl w:val="doNotCompress"/>
+  <w:compat>
+    <w:useFELayout/>
+    <w:compatSetting w:name="compatibilityMode" w:uri="http://schemas.microsoft.com/office/word" w:val="12"/>
+    <w:compatSetting w:name="useWord2013TrackBottomHyphenation" w:uri="http://schemas.microsoft.com/office/word" w:val="1"/>
+  </w:compat>
+  <w:rsids>
+    <w:rsidRoot w:val="006F555A"/>
+    <w:rsid w:val="006F555A"/>
+    <w:rsid w:val="00E21ED8"/>
+  </w:rsids>
+  <m:mathPr>
+    <m:mathFont m:val="Cambria Math"/>
+    <m:brkBin m:val="before"/>
+    <m:brkBinSub m:val="--"/>
+    <m:smallFrac m:val="0"/>
+    <m:dispDef/>
+    <m:lMargin m:val="0"/>
+    <m:rMargin m:val="0"/>
+    <m:defJc m:val="centerGroup"/>
+    <m:wrapIndent m:val="1440"/>
+    <m:intLim m:val="subSup"/>
+    <m:naryLim m:val="undOvr"/>
+  </m:mathPr>
+  <w:themeFontLang w:val="ru-RU"/>
+  <w:clrSchemeMapping w:bg1="light1" w:t1="dark1" w:bg2="light2" w:t2="dark2" w:accent1="accent1" w:accent2="accent2" w:accent3="accent3" w:accent4="accent4" w:accent5="accent5" w:accent6="accent6" w:hyperlink="hyperlink" w:followedHyperlink="followedHyperlink"/>
+  <w:shapeDefaults>
+    <o:shapedefaults v:ext="edit" spidmax="1026"/>
+    <o:shapelayout v:ext="edit">
+      <o:idmap v:ext="edit" data="1"/>
+    </o:shapelayout>
+  </w:shapeDefaults>
+  <w:decimalSymbol w:val=","/>
+  <w:listSeparator w:val=";"/>
+  <w14:docId w14:val="757B546E"/>
+  <w15:docId w15:val="{25404619-B7D0-4EF1-A42D-12F819968EB8}"/>
+</w:settings>
+</file>
+
+<file path=word\styles.xml><?xml version="1.0" encoding="utf-8"?>
 <w:styles xmlns:mc="http://schemas.openxmlformats.org/markup-compatibility/2006" xmlns:r="http://schemas.openxmlformats.org/officeDocument/2006/relationships" xmlns:w="http://schemas.openxmlformats.org/wordprocessingml/2006/main" xmlns:w14="http://schemas.microsoft.com/office/word/2010/wordml" xmlns:w15="http://schemas.microsoft.com/office/word/2012/wordml" xmlns:w16cex="http://schemas.microsoft.com/office/word/2018/wordml/cex" xmlns:w16cid="http://schemas.microsoft.com/office/word/2016/wordml/cid" xmlns:w16="http://schemas.microsoft.com/office/word/2018/wordml" xmlns:w16sdtdh="http://schemas.microsoft.com/office/word/2020/wordml/sdtdatahash" xmlns:w16se="http://schemas.microsoft.com/office/word/2015/wordml/symex" mc:Ignorable="w14 w15 w16se w16cid w16 w16cex w16sdtdh">
   <w:docDefaults>
     <w:rPrDefault>
@@ -5608,7 +5749,7 @@
 </w:styles>
 </file>
 
-<file path=word/theme/theme1.xml><?xml version="1.0" encoding="utf-8"?>
+<file path=word\theme\theme1.xml><?xml version="1.0" encoding="utf-8"?>
 <a:theme xmlns:a="http://schemas.openxmlformats.org/drawingml/2006/main" name="Тема Office">
   <a:themeElements>
     <a:clrScheme name="Стандартная">
@@ -5901,4 +6042,11 @@
     </a:ext>
   </a:extLst>
 </a:theme>
+</file>
+
+<file path=word\webSettings.xml><?xml version="1.0" encoding="utf-8"?>
+<w:webSettings xmlns:mc="http://schemas.openxmlformats.org/markup-compatibility/2006" xmlns:r="http://schemas.openxmlformats.org/officeDocument/2006/relationships" xmlns:w="http://schemas.openxmlformats.org/wordprocessingml/2006/main" xmlns:w14="http://schemas.microsoft.com/office/word/2010/wordml" xmlns:w15="http://schemas.microsoft.com/office/word/2012/wordml" xmlns:w16cex="http://schemas.microsoft.com/office/word/2018/wordml/cex" xmlns:w16cid="http://schemas.microsoft.com/office/word/2016/wordml/cid" xmlns:w16="http://schemas.microsoft.com/office/word/2018/wordml" xmlns:w16sdtdh="http://schemas.microsoft.com/office/word/2020/wordml/sdtdatahash" xmlns:w16se="http://schemas.microsoft.com/office/word/2015/wordml/symex" mc:Ignorable="w14 w15 w16se w16cid w16 w16cex w16sdtdh">
+  <w:relyOnVML/>
+  <w:allowPNG/>
+</w:webSettings>
 </file>
</xml_diff>